<commit_message>
Se agrega al repositorio los archivos del proyecto en Qt
</commit_message>
<xml_diff>
--- a/Analisis_y_diseño_desafio_1.docx
+++ b/Analisis_y_diseño_desafio_1.docx
@@ -6,11 +6,9 @@
       <w:r>
         <w:t>1.       </w:t>
       </w:r>
-      <w:proofErr w:type="spellStart"/>
-      <w:r>
-        <w:t>Analisis</w:t>
-      </w:r>
-      <w:proofErr w:type="spellEnd"/>
+      <w:r>
+        <w:t>Análisis</w:t>
+      </w:r>
       <w:r>
         <w:t xml:space="preserve"> del problema.</w:t>
       </w:r>
@@ -1723,6 +1721,7 @@
   <w:style w:type="character" w:default="1" w:styleId="Fuentedeprrafopredeter">
     <w:name w:val="Default Paragraph Font"/>
     <w:uiPriority w:val="1"/>
+    <w:semiHidden/>
     <w:unhideWhenUsed/>
   </w:style>
   <w:style w:type="table" w:default="1" w:styleId="Tablanormal">

</xml_diff>